<commit_message>
updated code with vectorized functions where possible
</commit_message>
<xml_diff>
--- a/Two Stage Deterministic equivalent/Two stage.docx
+++ b/Two Stage Deterministic equivalent/Two stage.docx
@@ -4,15 +4,7 @@
   <w:body>
     <w:p>
       <w:r>
-        <w:t xml:space="preserve">Two </w:t>
-      </w:r>
-      <w:proofErr w:type="gramStart"/>
-      <w:r>
-        <w:t>stage</w:t>
-      </w:r>
-      <w:proofErr w:type="gramEnd"/>
-      <w:r>
-        <w:t xml:space="preserve">: </w:t>
+        <w:t xml:space="preserve">Two stage: </w:t>
       </w:r>
       <w:r>
         <w:t>MVP</w:t>
@@ -20,21 +12,18 @@
     </w:p>
     <w:p>
       <w:r>
-        <w:t>Objective Value: 6.495381460758162e11</w:t>
+        <w:t>Objective Value: 6.712205747315876e10</w:t>
       </w:r>
     </w:p>
     <w:p>
       <w:r>
-        <w:t>Run Time: 1.5759999752044678</w:t>
+        <w:t>Run Time: 10.303999900817871</w:t>
       </w:r>
     </w:p>
     <w:p/>
     <w:p>
       <w:r>
-        <w:t xml:space="preserve">Det original: </w:t>
-      </w:r>
-      <w:r>
-        <w:t>Objective Value: 6.495381460758162e11</w:t>
+        <w:t>Det original: Objective Value: 6.495381460758162e11</w:t>
       </w:r>
     </w:p>
     <w:p>
@@ -45,15 +34,7 @@
     <w:p/>
     <w:p>
       <w:r>
-        <w:t xml:space="preserve">Two </w:t>
-      </w:r>
-      <w:proofErr w:type="gramStart"/>
-      <w:r>
-        <w:t>stage</w:t>
-      </w:r>
-      <w:proofErr w:type="gramEnd"/>
-      <w:r>
-        <w:t>: 5 scenarios:</w:t>
+        <w:t>Two stage: 5 scenarios:</w:t>
       </w:r>
     </w:p>
     <w:p>
@@ -69,21 +50,7 @@
     <w:p/>
     <w:p>
       <w:r>
-        <w:t xml:space="preserve">Two </w:t>
-      </w:r>
-      <w:proofErr w:type="gramStart"/>
-      <w:r>
-        <w:t>stage</w:t>
-      </w:r>
-      <w:proofErr w:type="gramEnd"/>
-      <w:r>
-        <w:t xml:space="preserve">: </w:t>
-      </w:r>
-      <w:r>
-        <w:t>10</w:t>
-      </w:r>
-      <w:r>
-        <w:t xml:space="preserve"> scenarios:</w:t>
+        <w:t>Two stage: 10 scenarios:</w:t>
       </w:r>
     </w:p>
     <w:p>

</xml_diff>

<commit_message>
working MVP and scenario models
</commit_message>
<xml_diff>
--- a/Two Stage Deterministic equivalent/Two stage.docx
+++ b/Two Stage Deterministic equivalent/Two stage.docx
@@ -9,60 +9,84 @@
       <w:r>
         <w:t>MVP</w:t>
       </w:r>
+      <w:r>
+        <w:t xml:space="preserve"> (30)</w:t>
+      </w:r>
     </w:p>
     <w:p>
       <w:r>
-        <w:t>Objective Value: 6.712205747315876e10</w:t>
+        <w:t>Best objective 7.061339807504e+10, best bound 7.060897364416e+10, gap 0.0063%</w:t>
       </w:r>
     </w:p>
     <w:p>
       <w:r>
-        <w:t>Run Time: 10.303999900817871</w:t>
+        <w:t>30</w:t>
+      </w:r>
+    </w:p>
+    <w:p>
+      <w:pPr>
+        <w:pBdr>
+          <w:bottom w:val="single" w:sz="12" w:space="1" w:color="auto"/>
+        </w:pBdr>
+      </w:pPr>
+      <w:r>
+        <w:t xml:space="preserve"> </w:t>
+      </w:r>
+    </w:p>
+    <w:p>
+      <w:r>
+        <w:t>Two stage: MVP (</w:t>
+      </w:r>
+      <w:r>
+        <w:t>2</w:t>
+      </w:r>
+      <w:r>
+        <w:t>0)</w:t>
+      </w:r>
+    </w:p>
+    <w:p>
+      <w:r>
+        <w:t>Best objective 7.061339807504e+10, best bound 7.060897364416e+10, gap 0.0063%</w:t>
+      </w:r>
+    </w:p>
+    <w:p>
+      <w:r>
+        <w:t>20</w:t>
+      </w:r>
+    </w:p>
+    <w:p>
+      <w:r>
+        <w:t>Best objective 6.726238611642e+10, best bound 6.726238611642e+10, gap 0.0000%</w:t>
+      </w:r>
+    </w:p>
+    <w:p>
+      <w:pPr>
+        <w:pBdr>
+          <w:bottom w:val="single" w:sz="12" w:space="1" w:color="auto"/>
+        </w:pBdr>
+      </w:pPr>
+    </w:p>
+    <w:p>
+      <w:r>
+        <w:t>Two stage: MVP (20)</w:t>
+      </w:r>
+    </w:p>
+    <w:p>
+      <w:r>
+        <w:t>Best objective 7.061339807504e+10, best bound 7.060897364416e+10, gap 0.0063%</w:t>
+      </w:r>
+    </w:p>
+    <w:p>
+      <w:r>
+        <w:t>20</w:t>
+      </w:r>
+    </w:p>
+    <w:p>
+      <w:r>
+        <w:t>Best objective 6.726238611642e+10, best bound 6.726238611642e+10, gap 0.0000%</w:t>
       </w:r>
     </w:p>
     <w:p/>
-    <w:p>
-      <w:r>
-        <w:t>Det original: Objective Value: 6.495381460758162e11</w:t>
-      </w:r>
-    </w:p>
-    <w:p>
-      <w:r>
-        <w:t>Run Time: 1.2760000228881836</w:t>
-      </w:r>
-    </w:p>
-    <w:p/>
-    <w:p>
-      <w:r>
-        <w:t>Two stage: 5 scenarios:</w:t>
-      </w:r>
-    </w:p>
-    <w:p>
-      <w:r>
-        <w:t>Objective Value: 6.7218342365585945e10</w:t>
-      </w:r>
-    </w:p>
-    <w:p>
-      <w:r>
-        <w:t>Run Time: 46.23199987411499</w:t>
-      </w:r>
-    </w:p>
-    <w:p/>
-    <w:p>
-      <w:r>
-        <w:t>Two stage: 10 scenarios:</w:t>
-      </w:r>
-    </w:p>
-    <w:p>
-      <w:r>
-        <w:t>Objective Value: 6.726238611641934e10</w:t>
-      </w:r>
-    </w:p>
-    <w:p>
-      <w:r>
-        <w:t>Run Time: 194.25999999046326</w:t>
-      </w:r>
-    </w:p>
     <w:sectPr>
       <w:pgSz w:w="12240" w:h="15840"/>
       <w:pgMar w:top="1440" w:right="1440" w:bottom="1440" w:left="1440" w:header="720" w:footer="720" w:gutter="0"/>

</xml_diff>

<commit_message>
working on making PC scenarios
</commit_message>
<xml_diff>
--- a/Two Stage Deterministic equivalent/Two stage.docx
+++ b/Two Stage Deterministic equivalent/Two stage.docx
@@ -4,41 +4,26 @@
   <w:body>
     <w:p>
       <w:r>
-        <w:t xml:space="preserve">Two stage: </w:t>
+        <w:t xml:space="preserve">Two </w:t>
       </w:r>
+      <w:proofErr w:type="gramStart"/>
+      <w:r>
+        <w:t>stage</w:t>
+      </w:r>
+      <w:proofErr w:type="gramEnd"/>
+      <w:r>
+        <w:t xml:space="preserve">: </w:t>
+      </w:r>
+    </w:p>
+    <w:p>
       <w:r>
         <w:t>MVP</w:t>
       </w:r>
       <w:r>
-        <w:t xml:space="preserve"> (30)</w:t>
-      </w:r>
-    </w:p>
-    <w:p>
-      <w:r>
-        <w:t>Best objective 7.061339807504e+10, best bound 7.060897364416e+10, gap 0.0063%</w:t>
-      </w:r>
-    </w:p>
-    <w:p>
-      <w:r>
-        <w:t>30</w:t>
-      </w:r>
-    </w:p>
-    <w:p>
-      <w:pPr>
-        <w:pBdr>
-          <w:bottom w:val="single" w:sz="12" w:space="1" w:color="auto"/>
-        </w:pBdr>
-      </w:pPr>
-      <w:r>
-        <w:t xml:space="preserve"> </w:t>
-      </w:r>
-    </w:p>
-    <w:p>
-      <w:r>
-        <w:t>Two stage: MVP (</w:t>
+        <w:t xml:space="preserve"> (</w:t>
       </w:r>
       <w:r>
-        <w:t>2</w:t>
+        <w:t>5</w:t>
       </w:r>
       <w:r>
         <w:t>0)</w:t>
@@ -46,47 +31,29 @@
     </w:p>
     <w:p>
       <w:r>
-        <w:t>Best objective 7.061339807504e+10, best bound 7.060897364416e+10, gap 0.0063%</w:t>
+        <w:t>Optimal solution found (tolerance 1.00e-04)</w:t>
       </w:r>
     </w:p>
     <w:p>
       <w:r>
-        <w:t>20</w:t>
+        <w:t>Best objective 6.743384558222e+10, best bound 6.742710243986e+10, gap 0.0100%</w:t>
       </w:r>
     </w:p>
     <w:p>
       <w:r>
-        <w:t>Best objective 6.726238611642e+10, best bound 6.726238611642e+10, gap 0.0000%</w:t>
-      </w:r>
-    </w:p>
-    <w:p>
-      <w:pPr>
-        <w:pBdr>
-          <w:bottom w:val="single" w:sz="12" w:space="1" w:color="auto"/>
-        </w:pBdr>
-      </w:pPr>
-    </w:p>
-    <w:p>
-      <w:r>
-        <w:t>Two stage: MVP (20)</w:t>
+        <w:t>50</w:t>
       </w:r>
     </w:p>
     <w:p>
       <w:r>
-        <w:t>Best objective 7.061339807504e+10, best bound 7.060897364416e+10, gap 0.0063%</w:t>
+        <w:t>Warning: max bound violation (1.1921e-06) exceeds tolerance</w:t>
       </w:r>
     </w:p>
     <w:p>
       <w:r>
-        <w:t>20</w:t>
+        <w:t>Best objective 6.768295637277e+10, best bound 6.727683428454e+10, gap 0.6000%</w:t>
       </w:r>
     </w:p>
-    <w:p>
-      <w:r>
-        <w:t>Best objective 6.726238611642e+10, best bound 6.726238611642e+10, gap 0.0000%</w:t>
-      </w:r>
-    </w:p>
-    <w:p/>
     <w:sectPr>
       <w:pgSz w:w="12240" w:h="15840"/>
       <w:pgMar w:top="1440" w:right="1440" w:bottom="1440" w:left="1440" w:header="720" w:footer="720" w:gutter="0"/>

</xml_diff>